<commit_message>
Atualizacao modelo de recibo final
</commit_message>
<xml_diff>
--- a/templates/modelo_recibo_domum_automacao.docx
+++ b/templates/modelo_recibo_domum_automacao.docx
@@ -208,25 +208,69 @@
     <w:p>
       <w:pPr>
         <w:spacing w:after="440" w:line="269" w:lineRule="auto"/>
-        <w:jc w:val="right"/>
+        <w:jc w:val="center"/>
       </w:pPr>
+      <w:r>
+        <w:rPr>
+          <w:b/>
+          <w:color w:val="404040"/>
+          <w:sz w:val="34"/>
+        </w:rPr>
+        <w:drawing>
+          <wp:anchor distT="0" distB="0" distL="114300" distR="114300" simplePos="0" relativeHeight="251659776" behindDoc="1" locked="0" layoutInCell="1" allowOverlap="1" wp14:anchorId="2452DBC1" wp14:editId="0117DA30">
+            <wp:simplePos x="0" y="0"/>
+            <wp:positionH relativeFrom="column">
+              <wp:posOffset>1808480</wp:posOffset>
+            </wp:positionH>
+            <wp:positionV relativeFrom="paragraph">
+              <wp:posOffset>163830</wp:posOffset>
+            </wp:positionV>
+            <wp:extent cx="2558415" cy="1339215"/>
+            <wp:effectExtent l="152400" t="381000" r="165735" b="394335"/>
+            <wp:wrapNone/>
+            <wp:docPr id="1727143396" name="Imagem 1"/>
+            <wp:cNvGraphicFramePr>
+              <a:graphicFrameLocks xmlns:a="http://schemas.openxmlformats.org/drawingml/2006/main" noChangeAspect="1"/>
+            </wp:cNvGraphicFramePr>
+            <a:graphic xmlns:a="http://schemas.openxmlformats.org/drawingml/2006/main">
+              <a:graphicData uri="http://schemas.openxmlformats.org/drawingml/2006/picture">
+                <pic:pic xmlns:pic="http://schemas.openxmlformats.org/drawingml/2006/picture">
+                  <pic:nvPicPr>
+                    <pic:cNvPr id="1727143396" name=""/>
+                    <pic:cNvPicPr/>
+                  </pic:nvPicPr>
+                  <pic:blipFill>
+                    <a:blip r:embed="rId8"/>
+                    <a:stretch>
+                      <a:fillRect/>
+                    </a:stretch>
+                  </pic:blipFill>
+                  <pic:spPr>
+                    <a:xfrm rot="1132376">
+                      <a:off x="0" y="0"/>
+                      <a:ext cx="2558415" cy="1339215"/>
+                    </a:xfrm>
+                    <a:prstGeom prst="rect">
+                      <a:avLst/>
+                    </a:prstGeom>
+                  </pic:spPr>
+                </pic:pic>
+              </a:graphicData>
+            </a:graphic>
+            <wp14:sizeRelH relativeFrom="margin">
+              <wp14:pctWidth>0</wp14:pctWidth>
+            </wp14:sizeRelH>
+            <wp14:sizeRelV relativeFrom="margin">
+              <wp14:pctHeight>0</wp14:pctHeight>
+            </wp14:sizeRelV>
+          </wp:anchor>
+        </w:drawing>
+      </w:r>
     </w:p>
     <w:p>
       <w:pPr>
         <w:spacing w:after="440" w:line="269" w:lineRule="auto"/>
-        <w:jc w:val="right"/>
-      </w:pPr>
-    </w:p>
-    <w:p>
-      <w:pPr>
-        <w:spacing w:after="440" w:line="269" w:lineRule="auto"/>
-        <w:jc w:val="right"/>
-      </w:pPr>
-    </w:p>
-    <w:p>
-      <w:pPr>
-        <w:spacing w:after="440" w:line="269" w:lineRule="auto"/>
-        <w:jc w:val="right"/>
+        <w:jc w:val="center"/>
       </w:pPr>
     </w:p>
     <w:p>
@@ -237,6 +281,17 @@
       <w:r>
         <w:t>________________________________________</w:t>
       </w:r>
+    </w:p>
+    <w:p>
+      <w:pPr>
+        <w:spacing w:after="0"/>
+        <w:jc w:val="center"/>
+        <w:rPr>
+          <w:b/>
+          <w:color w:val="404040"/>
+          <w:sz w:val="20"/>
+        </w:rPr>
+      </w:pPr>
     </w:p>
     <w:p>
       <w:pPr>
@@ -319,8 +374,8 @@
       </w:r>
     </w:p>
     <w:sectPr>
-      <w:headerReference w:type="default" r:id="rId8"/>
-      <w:footerReference w:type="default" r:id="rId9"/>
+      <w:headerReference w:type="default" r:id="rId9"/>
+      <w:footerReference w:type="default" r:id="rId10"/>
       <w:pgSz w:w="12240" w:h="15840"/>
       <w:pgMar w:top="964" w:right="1134" w:bottom="850" w:left="1134" w:header="720" w:footer="720" w:gutter="0"/>
       <w:pgBorders w:offsetFrom="page">

</xml_diff>